<commit_message>
Add ProgrammingExercise 6 code and technical document.
</commit_message>
<xml_diff>
--- a/ProgrammingExercise6/NateLawonn_ProgrammingExercise_6.docx
+++ b/ProgrammingExercise6/NateLawonn_ProgrammingExercise_6.docx
@@ -32,15 +32,7 @@
     </w:p>
     <w:p>
       <w:r>
-        <w:t xml:space="preserve">Asks the user to enter 1, 2, or 3, corresponding to the type of number to verify. If </w:t>
-      </w:r>
-      <w:proofErr w:type="gramStart"/>
-      <w:r>
-        <w:t>anything</w:t>
-      </w:r>
-      <w:proofErr w:type="gramEnd"/>
-      <w:r>
-        <w:t xml:space="preserve"> else is entered, prompts the user to enter a valid choice.</w:t>
+        <w:t>Asks the user to enter 1, 2, or 3, corresponding to the type of number to verify. If anything else is entered, prompts the user to enter a valid choice.</w:t>
       </w:r>
     </w:p>
     <w:p>
@@ -553,6 +545,20 @@
         <w:t>Prints “Number accepted.” once a valid entry is provided.</w:t>
       </w:r>
     </w:p>
+    <w:p>
+      <w:hyperlink r:id="rId6" w:history="1">
+        <w:r>
+          <w:rPr>
+            <w:rStyle w:val="Hyperlink"/>
+          </w:rPr>
+          <w:t>https://github.com/nlawonn/ProgrammingConcepts2</w:t>
+        </w:r>
+      </w:hyperlink>
+      <w:r>
+        <w:t xml:space="preserve"> </w:t>
+      </w:r>
+    </w:p>
+    <w:p/>
     <w:p>
       <w:r>
         <w:drawing>
@@ -571,7 +577,7 @@
                     <pic:cNvPicPr/>
                   </pic:nvPicPr>
                   <pic:blipFill>
-                    <a:blip r:embed="rId6"/>
+                    <a:blip r:embed="rId7"/>
                     <a:stretch>
                       <a:fillRect/>
                     </a:stretch>
@@ -608,7 +614,7 @@
                     <pic:cNvPicPr/>
                   </pic:nvPicPr>
                   <pic:blipFill>
-                    <a:blip r:embed="rId7"/>
+                    <a:blip r:embed="rId8"/>
                     <a:stretch>
                       <a:fillRect/>
                     </a:stretch>
@@ -645,7 +651,7 @@
                     <pic:cNvPicPr/>
                   </pic:nvPicPr>
                   <pic:blipFill>
-                    <a:blip r:embed="rId8"/>
+                    <a:blip r:embed="rId9"/>
                     <a:stretch>
                       <a:fillRect/>
                     </a:stretch>
@@ -1966,6 +1972,29 @@
       <w:spacing w:val="5"/>
     </w:rPr>
   </w:style>
+  <w:style w:type="character" w:styleId="Hyperlink">
+    <w:name w:val="Hyperlink"/>
+    <w:basedOn w:val="DefaultParagraphFont"/>
+    <w:uiPriority w:val="99"/>
+    <w:unhideWhenUsed/>
+    <w:rsid w:val="006139FD"/>
+    <w:rPr>
+      <w:color w:val="467886" w:themeColor="hyperlink"/>
+      <w:u w:val="single"/>
+    </w:rPr>
+  </w:style>
+  <w:style w:type="character" w:styleId="UnresolvedMention">
+    <w:name w:val="Unresolved Mention"/>
+    <w:basedOn w:val="DefaultParagraphFont"/>
+    <w:uiPriority w:val="99"/>
+    <w:semiHidden/>
+    <w:unhideWhenUsed/>
+    <w:rsid w:val="006139FD"/>
+    <w:rPr>
+      <w:color w:val="605E5C"/>
+      <w:shd w:val="clear" w:color="auto" w:fill="E1DFDD"/>
+    </w:rPr>
+  </w:style>
 </w:styles>
 </file>
 

</xml_diff>

<commit_message>
Updated screenshots to reflect updated code.
</commit_message>
<xml_diff>
--- a/ProgrammingExercise6/NateLawonn_ProgrammingExercise_6.docx
+++ b/ProgrammingExercise6/NateLawonn_ProgrammingExercise_6.docx
@@ -14,15 +14,7 @@
     </w:p>
     <w:p>
       <w:r>
-        <w:t xml:space="preserve">##Program Description: A program that asks for the user to enter a number corresponding to the desired number format to verify. Uses </w:t>
-      </w:r>
-      <w:proofErr w:type="spellStart"/>
-      <w:r>
-        <w:t>re.fullmatch</w:t>
-      </w:r>
-      <w:proofErr w:type="spellEnd"/>
-      <w:r>
-        <w:t>() to verify the input is in the exact format. If input is in the wrong format, prompts the user to try again. If correct, prints “Number accepted.”</w:t>
+        <w:t>##Program Description: A program that asks for the user to enter a number corresponding to the desired number format to verify. Uses re.fullmatch() to verify the input is in the exact format. If input is in the wrong format, prompts the user to try again. If correct, prints “Number accepted.”</w:t>
       </w:r>
     </w:p>
     <w:p>
@@ -114,13 +106,8 @@
     </w:p>
     <w:p>
       <w:r>
-        <w:t xml:space="preserve">##Function: </w:t>
-      </w:r>
-      <w:proofErr w:type="spellStart"/>
-      <w:r>
-        <w:t>phone_num</w:t>
-      </w:r>
-      <w:proofErr w:type="spellEnd"/>
+        <w:t>##Function: phone_num</w:t>
+      </w:r>
     </w:p>
     <w:p>
       <w:r>
@@ -130,15 +117,7 @@
         <w:t>10-digit</w:t>
       </w:r>
       <w:r>
-        <w:t xml:space="preserve"> phone number, formatted exactly as xxx-xxx-</w:t>
-      </w:r>
-      <w:proofErr w:type="spellStart"/>
-      <w:r>
-        <w:t>xxxx</w:t>
-      </w:r>
-      <w:proofErr w:type="spellEnd"/>
-      <w:r>
-        <w:t xml:space="preserve">. Prompts again if </w:t>
+        <w:t xml:space="preserve"> phone number, formatted exactly as xxx-xxx-xxxx. Prompts again if </w:t>
       </w:r>
       <w:r>
         <w:t>formatting rules are violated</w:t>
@@ -214,15 +193,7 @@
         </w:numPr>
       </w:pPr>
       <w:r>
-        <w:t>Asks the user to enter a 10-digit phone number formatted xxx-xxx-</w:t>
-      </w:r>
-      <w:proofErr w:type="spellStart"/>
-      <w:r>
-        <w:t>xxxx</w:t>
-      </w:r>
-      <w:proofErr w:type="spellEnd"/>
-      <w:r>
-        <w:t>.</w:t>
+        <w:t>Asks the user to enter a 10-digit phone number formatted xxx-xxx-xxxx.</w:t>
       </w:r>
     </w:p>
     <w:p>
@@ -234,15 +205,7 @@
         </w:numPr>
       </w:pPr>
       <w:r>
-        <w:t xml:space="preserve">Uses </w:t>
-      </w:r>
-      <w:proofErr w:type="spellStart"/>
-      <w:r>
-        <w:t>re.fullmatch</w:t>
-      </w:r>
-      <w:proofErr w:type="spellEnd"/>
-      <w:r>
-        <w:t xml:space="preserve">() to </w:t>
+        <w:t xml:space="preserve">Uses re.fullmatch() to </w:t>
       </w:r>
       <w:r>
         <w:t>validate the input. If there are letters, incorrect dashes, or an invalid length, prompts the user again</w:t>
@@ -274,13 +237,8 @@
     </w:p>
     <w:p>
       <w:r>
-        <w:t xml:space="preserve">##Function </w:t>
-      </w:r>
-      <w:proofErr w:type="spellStart"/>
-      <w:r>
-        <w:t>socsec_num</w:t>
-      </w:r>
-      <w:proofErr w:type="spellEnd"/>
+        <w:t>##Function socsec_num</w:t>
+      </w:r>
     </w:p>
     <w:p>
       <w:r>
@@ -302,15 +260,7 @@
         <w:t>N</w:t>
       </w:r>
       <w:r>
-        <w:t>umber, formatted exactly as xxx-xx-</w:t>
-      </w:r>
-      <w:proofErr w:type="spellStart"/>
-      <w:r>
-        <w:t>xxxx</w:t>
-      </w:r>
-      <w:proofErr w:type="spellEnd"/>
-      <w:r>
-        <w:t>. Prompts again if formatting rules are violated. Prints “Number accepted.” when entered correctly.</w:t>
+        <w:t>umber, formatted exactly as xxx-xx-xxxx. Prompts again if formatting rules are violated. Prints “Number accepted.” when entered correctly.</w:t>
       </w:r>
     </w:p>
     <w:p>
@@ -367,15 +317,7 @@
         </w:numPr>
       </w:pPr>
       <w:r>
-        <w:t>Asks the user to enter a 9-digit Social Security Number formatted xxx-xx-</w:t>
-      </w:r>
-      <w:proofErr w:type="spellStart"/>
-      <w:r>
-        <w:t>xxxx</w:t>
-      </w:r>
-      <w:proofErr w:type="spellEnd"/>
-      <w:r>
-        <w:t>.</w:t>
+        <w:t>Asks the user to enter a 9-digit Social Security Number formatted xxx-xx-xxxx.</w:t>
       </w:r>
     </w:p>
     <w:p>
@@ -387,15 +329,7 @@
         </w:numPr>
       </w:pPr>
       <w:r>
-        <w:t xml:space="preserve">Uses </w:t>
-      </w:r>
-      <w:proofErr w:type="spellStart"/>
-      <w:r>
-        <w:t>re.fullmatch</w:t>
-      </w:r>
-      <w:proofErr w:type="spellEnd"/>
-      <w:r>
-        <w:t>() to validate the input. If there are letters, incorrect dashes, or an invalid length, prompts the user again.</w:t>
+        <w:t>Uses re.fullmatch() to validate the input. If there are letters, incorrect dashes, or an invalid length, prompts the user again.</w:t>
       </w:r>
     </w:p>
     <w:p>
@@ -412,33 +346,12 @@
     </w:p>
     <w:p>
       <w:r>
-        <w:t xml:space="preserve">##Function </w:t>
-      </w:r>
-      <w:proofErr w:type="spellStart"/>
-      <w:r>
-        <w:t>zip_code</w:t>
-      </w:r>
-      <w:proofErr w:type="spellEnd"/>
-    </w:p>
-    <w:p>
-      <w:r>
-        <w:t xml:space="preserve">Asks the user to enter a 5-digit </w:t>
-      </w:r>
-      <w:proofErr w:type="spellStart"/>
-      <w:r>
-        <w:t>zipcode</w:t>
-      </w:r>
-      <w:proofErr w:type="spellEnd"/>
-      <w:r>
-        <w:t xml:space="preserve"> formatted exactly as </w:t>
-      </w:r>
-      <w:proofErr w:type="spellStart"/>
-      <w:r>
-        <w:t>xxxxx</w:t>
-      </w:r>
-      <w:proofErr w:type="spellEnd"/>
-      <w:r>
-        <w:t>. Prompts again if formatting rules are violated. Prints “Number accepted.” when entered correctly.</w:t>
+        <w:t>##Function zip_code</w:t>
+      </w:r>
+    </w:p>
+    <w:p>
+      <w:r>
+        <w:t>Asks the user to enter a 5-digit zipcode formatted exactly as xxxxx. Prompts again if formatting rules are violated. Prints “Number accepted.” when entered correctly.</w:t>
       </w:r>
     </w:p>
     <w:p>
@@ -502,15 +415,7 @@
         </w:numPr>
       </w:pPr>
       <w:r>
-        <w:t xml:space="preserve">Asks the user to enter a 5-digit zip code formatted </w:t>
-      </w:r>
-      <w:proofErr w:type="spellStart"/>
-      <w:r>
-        <w:t>xxxxx</w:t>
-      </w:r>
-      <w:proofErr w:type="spellEnd"/>
-      <w:r>
-        <w:t>.</w:t>
+        <w:t>Asks the user to enter a 5-digit zip code formatted xxxxx.</w:t>
       </w:r>
     </w:p>
     <w:p>
@@ -522,15 +427,7 @@
         </w:numPr>
       </w:pPr>
       <w:r>
-        <w:t xml:space="preserve">Uses </w:t>
-      </w:r>
-      <w:proofErr w:type="spellStart"/>
-      <w:r>
-        <w:t>re.fullmatch</w:t>
-      </w:r>
-      <w:proofErr w:type="spellEnd"/>
-      <w:r>
-        <w:t>() to validate the input. If there are letters, incorrect dashes, or an invalid length, prompts the user again.</w:t>
+        <w:t>Uses re.fullmatch() to validate the input. If there are letters, incorrect dashes, or an invalid length, prompts the user again.</w:t>
       </w:r>
     </w:p>
     <w:p>
@@ -558,14 +455,13 @@
         <w:t xml:space="preserve"> </w:t>
       </w:r>
     </w:p>
-    <w:p/>
     <w:p>
       <w:r>
         <w:drawing>
-          <wp:inline distT="0" distB="0" distL="0" distR="0" wp14:anchorId="1D0ED54B" wp14:editId="2F82254A">
-            <wp:extent cx="5943600" cy="1118235"/>
-            <wp:effectExtent l="0" t="0" r="0" b="5715"/>
-            <wp:docPr id="737064110" name="Picture 1"/>
+          <wp:inline distT="0" distB="0" distL="0" distR="0" wp14:anchorId="0ACA01E4" wp14:editId="023C426B">
+            <wp:extent cx="5943600" cy="1122045"/>
+            <wp:effectExtent l="0" t="0" r="0" b="1905"/>
+            <wp:docPr id="998426920" name="Picture 1"/>
             <wp:cNvGraphicFramePr>
               <a:graphicFrameLocks xmlns:a="http://schemas.openxmlformats.org/drawingml/2006/main" noChangeAspect="1"/>
             </wp:cNvGraphicFramePr>
@@ -573,7 +469,7 @@
               <a:graphicData uri="http://schemas.openxmlformats.org/drawingml/2006/picture">
                 <pic:pic xmlns:pic="http://schemas.openxmlformats.org/drawingml/2006/picture">
                   <pic:nvPicPr>
-                    <pic:cNvPr id="737064110" name=""/>
+                    <pic:cNvPr id="998426920" name=""/>
                     <pic:cNvPicPr/>
                   </pic:nvPicPr>
                   <pic:blipFill>
@@ -585,7 +481,7 @@
                   <pic:spPr>
                     <a:xfrm>
                       <a:off x="0" y="0"/>
-                      <a:ext cx="5943600" cy="1118235"/>
+                      <a:ext cx="5943600" cy="1122045"/>
                     </a:xfrm>
                     <a:prstGeom prst="rect">
                       <a:avLst/>
@@ -599,10 +495,10 @@
       </w:r>
       <w:r>
         <w:drawing>
-          <wp:inline distT="0" distB="0" distL="0" distR="0" wp14:anchorId="0C30B3EF" wp14:editId="7244302E">
-            <wp:extent cx="5943600" cy="1109345"/>
-            <wp:effectExtent l="0" t="0" r="0" b="0"/>
-            <wp:docPr id="498817128" name="Picture 1"/>
+          <wp:inline distT="0" distB="0" distL="0" distR="0" wp14:anchorId="7ABE9D24" wp14:editId="2C61BB7E">
+            <wp:extent cx="5943600" cy="1118870"/>
+            <wp:effectExtent l="0" t="0" r="0" b="5080"/>
+            <wp:docPr id="1867054041" name="Picture 1"/>
             <wp:cNvGraphicFramePr>
               <a:graphicFrameLocks xmlns:a="http://schemas.openxmlformats.org/drawingml/2006/main" noChangeAspect="1"/>
             </wp:cNvGraphicFramePr>
@@ -610,7 +506,7 @@
               <a:graphicData uri="http://schemas.openxmlformats.org/drawingml/2006/picture">
                 <pic:pic xmlns:pic="http://schemas.openxmlformats.org/drawingml/2006/picture">
                   <pic:nvPicPr>
-                    <pic:cNvPr id="498817128" name=""/>
+                    <pic:cNvPr id="1867054041" name=""/>
                     <pic:cNvPicPr/>
                   </pic:nvPicPr>
                   <pic:blipFill>
@@ -622,7 +518,7 @@
                   <pic:spPr>
                     <a:xfrm>
                       <a:off x="0" y="0"/>
-                      <a:ext cx="5943600" cy="1109345"/>
+                      <a:ext cx="5943600" cy="1118870"/>
                     </a:xfrm>
                     <a:prstGeom prst="rect">
                       <a:avLst/>
@@ -636,10 +532,10 @@
       </w:r>
       <w:r>
         <w:drawing>
-          <wp:inline distT="0" distB="0" distL="0" distR="0" wp14:anchorId="13F3077B" wp14:editId="342040C4">
-            <wp:extent cx="5943600" cy="963930"/>
-            <wp:effectExtent l="0" t="0" r="0" b="7620"/>
-            <wp:docPr id="340836958" name="Picture 1"/>
+          <wp:inline distT="0" distB="0" distL="0" distR="0" wp14:anchorId="5CB3FA1C" wp14:editId="2655BE09">
+            <wp:extent cx="5943600" cy="934720"/>
+            <wp:effectExtent l="0" t="0" r="0" b="0"/>
+            <wp:docPr id="820995592" name="Picture 1"/>
             <wp:cNvGraphicFramePr>
               <a:graphicFrameLocks xmlns:a="http://schemas.openxmlformats.org/drawingml/2006/main" noChangeAspect="1"/>
             </wp:cNvGraphicFramePr>
@@ -647,7 +543,7 @@
               <a:graphicData uri="http://schemas.openxmlformats.org/drawingml/2006/picture">
                 <pic:pic xmlns:pic="http://schemas.openxmlformats.org/drawingml/2006/picture">
                   <pic:nvPicPr>
-                    <pic:cNvPr id="340836958" name=""/>
+                    <pic:cNvPr id="820995592" name=""/>
                     <pic:cNvPicPr/>
                   </pic:nvPicPr>
                   <pic:blipFill>
@@ -659,7 +555,7 @@
                   <pic:spPr>
                     <a:xfrm>
                       <a:off x="0" y="0"/>
-                      <a:ext cx="5943600" cy="963930"/>
+                      <a:ext cx="5943600" cy="934720"/>
                     </a:xfrm>
                     <a:prstGeom prst="rect">
                       <a:avLst/>

</xml_diff>

<commit_message>
Updated link to ProgrammingExercise6 folder.
</commit_message>
<xml_diff>
--- a/ProgrammingExercise6/NateLawonn_ProgrammingExercise_6.docx
+++ b/ProgrammingExercise6/NateLawonn_ProgrammingExercise_6.docx
@@ -14,7 +14,15 @@
     </w:p>
     <w:p>
       <w:r>
-        <w:t>##Program Description: A program that asks for the user to enter a number corresponding to the desired number format to verify. Uses re.fullmatch() to verify the input is in the exact format. If input is in the wrong format, prompts the user to try again. If correct, prints “Number accepted.”</w:t>
+        <w:t xml:space="preserve">##Program Description: A program that asks for the user to enter a number corresponding to the desired number format to verify. Uses </w:t>
+      </w:r>
+      <w:proofErr w:type="spellStart"/>
+      <w:r>
+        <w:t>re.fullmatch</w:t>
+      </w:r>
+      <w:proofErr w:type="spellEnd"/>
+      <w:r>
+        <w:t>() to verify the input is in the exact format. If input is in the wrong format, prompts the user to try again. If correct, prints “Number accepted.”</w:t>
       </w:r>
     </w:p>
     <w:p>
@@ -106,8 +114,13 @@
     </w:p>
     <w:p>
       <w:r>
-        <w:t>##Function: phone_num</w:t>
-      </w:r>
+        <w:t xml:space="preserve">##Function: </w:t>
+      </w:r>
+      <w:proofErr w:type="spellStart"/>
+      <w:r>
+        <w:t>phone_num</w:t>
+      </w:r>
+      <w:proofErr w:type="spellEnd"/>
     </w:p>
     <w:p>
       <w:r>
@@ -117,7 +130,15 @@
         <w:t>10-digit</w:t>
       </w:r>
       <w:r>
-        <w:t xml:space="preserve"> phone number, formatted exactly as xxx-xxx-xxxx. Prompts again if </w:t>
+        <w:t xml:space="preserve"> phone number, formatted exactly as xxx-xxx-</w:t>
+      </w:r>
+      <w:proofErr w:type="spellStart"/>
+      <w:r>
+        <w:t>xxxx</w:t>
+      </w:r>
+      <w:proofErr w:type="spellEnd"/>
+      <w:r>
+        <w:t xml:space="preserve">. Prompts again if </w:t>
       </w:r>
       <w:r>
         <w:t>formatting rules are violated</w:t>
@@ -193,7 +214,15 @@
         </w:numPr>
       </w:pPr>
       <w:r>
-        <w:t>Asks the user to enter a 10-digit phone number formatted xxx-xxx-xxxx.</w:t>
+        <w:t>Asks the user to enter a 10-digit phone number formatted xxx-xxx-</w:t>
+      </w:r>
+      <w:proofErr w:type="spellStart"/>
+      <w:r>
+        <w:t>xxxx</w:t>
+      </w:r>
+      <w:proofErr w:type="spellEnd"/>
+      <w:r>
+        <w:t>.</w:t>
       </w:r>
     </w:p>
     <w:p>
@@ -205,7 +234,15 @@
         </w:numPr>
       </w:pPr>
       <w:r>
-        <w:t xml:space="preserve">Uses re.fullmatch() to </w:t>
+        <w:t xml:space="preserve">Uses </w:t>
+      </w:r>
+      <w:proofErr w:type="spellStart"/>
+      <w:r>
+        <w:t>re.fullmatch</w:t>
+      </w:r>
+      <w:proofErr w:type="spellEnd"/>
+      <w:r>
+        <w:t xml:space="preserve">() to </w:t>
       </w:r>
       <w:r>
         <w:t>validate the input. If there are letters, incorrect dashes, or an invalid length, prompts the user again</w:t>
@@ -237,8 +274,13 @@
     </w:p>
     <w:p>
       <w:r>
-        <w:t>##Function socsec_num</w:t>
-      </w:r>
+        <w:t xml:space="preserve">##Function </w:t>
+      </w:r>
+      <w:proofErr w:type="spellStart"/>
+      <w:r>
+        <w:t>socsec_num</w:t>
+      </w:r>
+      <w:proofErr w:type="spellEnd"/>
     </w:p>
     <w:p>
       <w:r>
@@ -260,7 +302,15 @@
         <w:t>N</w:t>
       </w:r>
       <w:r>
-        <w:t>umber, formatted exactly as xxx-xx-xxxx. Prompts again if formatting rules are violated. Prints “Number accepted.” when entered correctly.</w:t>
+        <w:t>umber, formatted exactly as xxx-xx-</w:t>
+      </w:r>
+      <w:proofErr w:type="spellStart"/>
+      <w:r>
+        <w:t>xxxx</w:t>
+      </w:r>
+      <w:proofErr w:type="spellEnd"/>
+      <w:r>
+        <w:t>. Prompts again if formatting rules are violated. Prints “Number accepted.” when entered correctly.</w:t>
       </w:r>
     </w:p>
     <w:p>
@@ -317,7 +367,15 @@
         </w:numPr>
       </w:pPr>
       <w:r>
-        <w:t>Asks the user to enter a 9-digit Social Security Number formatted xxx-xx-xxxx.</w:t>
+        <w:t>Asks the user to enter a 9-digit Social Security Number formatted xxx-xx-</w:t>
+      </w:r>
+      <w:proofErr w:type="spellStart"/>
+      <w:r>
+        <w:t>xxxx</w:t>
+      </w:r>
+      <w:proofErr w:type="spellEnd"/>
+      <w:r>
+        <w:t>.</w:t>
       </w:r>
     </w:p>
     <w:p>
@@ -329,7 +387,15 @@
         </w:numPr>
       </w:pPr>
       <w:r>
-        <w:t>Uses re.fullmatch() to validate the input. If there are letters, incorrect dashes, or an invalid length, prompts the user again.</w:t>
+        <w:t xml:space="preserve">Uses </w:t>
+      </w:r>
+      <w:proofErr w:type="spellStart"/>
+      <w:r>
+        <w:t>re.fullmatch</w:t>
+      </w:r>
+      <w:proofErr w:type="spellEnd"/>
+      <w:r>
+        <w:t>() to validate the input. If there are letters, incorrect dashes, or an invalid length, prompts the user again.</w:t>
       </w:r>
     </w:p>
     <w:p>
@@ -346,12 +412,33 @@
     </w:p>
     <w:p>
       <w:r>
-        <w:t>##Function zip_code</w:t>
-      </w:r>
-    </w:p>
-    <w:p>
-      <w:r>
-        <w:t>Asks the user to enter a 5-digit zipcode formatted exactly as xxxxx. Prompts again if formatting rules are violated. Prints “Number accepted.” when entered correctly.</w:t>
+        <w:t xml:space="preserve">##Function </w:t>
+      </w:r>
+      <w:proofErr w:type="spellStart"/>
+      <w:r>
+        <w:t>zip_code</w:t>
+      </w:r>
+      <w:proofErr w:type="spellEnd"/>
+    </w:p>
+    <w:p>
+      <w:r>
+        <w:t xml:space="preserve">Asks the user to enter a 5-digit </w:t>
+      </w:r>
+      <w:proofErr w:type="spellStart"/>
+      <w:r>
+        <w:t>zipcode</w:t>
+      </w:r>
+      <w:proofErr w:type="spellEnd"/>
+      <w:r>
+        <w:t xml:space="preserve"> formatted exactly as </w:t>
+      </w:r>
+      <w:proofErr w:type="spellStart"/>
+      <w:r>
+        <w:t>xxxxx</w:t>
+      </w:r>
+      <w:proofErr w:type="spellEnd"/>
+      <w:r>
+        <w:t>. Prompts again if formatting rules are violated. Prints “Number accepted.” when entered correctly.</w:t>
       </w:r>
     </w:p>
     <w:p>
@@ -415,7 +502,15 @@
         </w:numPr>
       </w:pPr>
       <w:r>
-        <w:t>Asks the user to enter a 5-digit zip code formatted xxxxx.</w:t>
+        <w:t xml:space="preserve">Asks the user to enter a 5-digit zip code formatted </w:t>
+      </w:r>
+      <w:proofErr w:type="spellStart"/>
+      <w:r>
+        <w:t>xxxxx</w:t>
+      </w:r>
+      <w:proofErr w:type="spellEnd"/>
+      <w:r>
+        <w:t>.</w:t>
       </w:r>
     </w:p>
     <w:p>
@@ -427,7 +522,15 @@
         </w:numPr>
       </w:pPr>
       <w:r>
-        <w:t>Uses re.fullmatch() to validate the input. If there are letters, incorrect dashes, or an invalid length, prompts the user again.</w:t>
+        <w:t xml:space="preserve">Uses </w:t>
+      </w:r>
+      <w:proofErr w:type="spellStart"/>
+      <w:r>
+        <w:t>re.fullmatch</w:t>
+      </w:r>
+      <w:proofErr w:type="spellEnd"/>
+      <w:r>
+        <w:t>() to validate the input. If there are letters, incorrect dashes, or an invalid length, prompts the user again.</w:t>
       </w:r>
     </w:p>
     <w:p>
@@ -443,12 +546,15 @@
       </w:r>
     </w:p>
     <w:p>
+      <w:pPr>
+        <w:ind w:left="360"/>
+      </w:pPr>
       <w:hyperlink r:id="rId6" w:history="1">
         <w:r>
           <w:rPr>
             <w:rStyle w:val="Hyperlink"/>
           </w:rPr>
-          <w:t>https://github.com/nlawonn/ProgrammingConcepts2</w:t>
+          <w:t>https://github.com/nlawonn/ProgrammingConcepts2/tree/master/ProgrammingExercise6</w:t>
         </w:r>
       </w:hyperlink>
       <w:r>

</xml_diff>